<commit_message>
update readme and reports
</commit_message>
<xml_diff>
--- a/report/hw3_2453619_薛毓哲.docx
+++ b/report/hw3_2453619_薛毓哲.docx
@@ -136,20 +136,6 @@
       <w:pPr>
         <w:spacing w:before="400" w:after="80"/>
         <w:jc w:val="center"/>
-      </w:pPr>
-      <w:r>
-        <w:rPr>
-          <w:rFonts w:ascii="宋体" w:hAnsi="宋体" w:eastAsia="宋体"/>
-          <w:sz w:val="24"/>
-        </w:rPr>
-        <w:t>项目公开可访问链接：</w:t>
-      </w:r>
-    </w:p>
-    <w:p>
-      <w:pPr>
-        <w:spacing w:after="0"/>
-        <w:ind w:firstLine="0"/>
-        <w:jc w:val="center"/>
         <w:sectPr>
           <w:footerReference r:id="rId5" w:type="default"/>
           <w:pgSz w:w="11906" w:h="16838"/>
@@ -164,6 +150,15 @@
           <w:docGrid w:linePitch="360" w:charSpace="0"/>
         </w:sectPr>
       </w:pPr>
+      <w:r>
+        <w:rPr>
+          <w:rFonts w:ascii="宋体" w:hAnsi="宋体" w:eastAsia="宋体"/>
+          <w:sz w:val="24"/>
+        </w:rPr>
+        <w:t>项目公开可访问链接：</w:t>
+      </w:r>
+      <w:bookmarkStart w:id="0" w:name="_GoBack"/>
+      <w:bookmarkEnd w:id="0"/>
       <w:r>
         <w:rPr>
           <w:rFonts w:ascii="Times New Roman" w:hAnsi="Times New Roman"/>
@@ -907,6 +902,12 @@
             <w:insideH w:val="single" w:color="auto" w:sz="4" w:space="0"/>
             <w:insideV w:val="single" w:color="auto" w:sz="4" w:space="0"/>
           </w:tblBorders>
+          <w:tblCellMar>
+            <w:top w:w="0" w:type="dxa"/>
+            <w:left w:w="108" w:type="dxa"/>
+            <w:bottom w:w="0" w:type="dxa"/>
+            <w:right w:w="108" w:type="dxa"/>
+          </w:tblCellMar>
         </w:tblPrEx>
         <w:trPr>
           <w:jc w:val="center"/>
@@ -1627,6 +1628,12 @@
             <w:insideH w:val="single" w:color="auto" w:sz="4" w:space="0"/>
             <w:insideV w:val="single" w:color="auto" w:sz="4" w:space="0"/>
           </w:tblBorders>
+          <w:tblCellMar>
+            <w:top w:w="0" w:type="dxa"/>
+            <w:left w:w="108" w:type="dxa"/>
+            <w:bottom w:w="0" w:type="dxa"/>
+            <w:right w:w="108" w:type="dxa"/>
+          </w:tblCellMar>
         </w:tblPrEx>
         <w:trPr>
           <w:jc w:val="center"/>

</xml_diff>